<commit_message>
Se agrega: capturas de evidencia de la actividad
</commit_message>
<xml_diff>
--- a/docs/Actividad_S3_Ingenieria_Inversa.docx
+++ b/docs/Actividad_S3_Ingenieria_Inversa.docx
@@ -38,30 +38,6 @@
       <w:r>
         <w:rPr>
           <w:rFonts w:ascii="Calibri" w:hAnsi="Calibri"/>
-          <w:sz w:val="22"/>
-        </w:rPr>
-        <w:t xml:space="preserve">Alumno: ______________________________     Curso: ______________________________</w:t>
-      </w:r>
-    </w:p>
-    <w:p>
-      <w:pPr>
-        <w:spacing w:after="60"/>
-      </w:pPr>
-      <w:r>
-        <w:rPr>
-          <w:rFonts w:ascii="Calibri" w:hAnsi="Calibri"/>
-          <w:sz w:val="22"/>
-        </w:rPr>
-        <w:t xml:space="preserve">Docente: ______________________________     Fecha: 31 / 08 / 2026</w:t>
-      </w:r>
-    </w:p>
-    <w:p>
-      <w:pPr>
-        <w:spacing w:after="60"/>
-      </w:pPr>
-      <w:r>
-        <w:rPr>
-          <w:rFonts w:ascii="Calibri" w:hAnsi="Calibri"/>
           <w:b/>
           <w:sz w:val="22"/>
         </w:rPr>
@@ -281,23 +257,60 @@
     </w:p>
     <w:p>
       <w:pPr>
-        <w:pBdr>
-          <w:top w:val="dashed" w:sz="6" w:space="8" w:color="A6A6A6"/>
-          <w:left w:val="dashed" w:sz="6" w:space="8" w:color="A6A6A6"/>
-          <w:bottom w:val="dashed" w:sz="6" w:space="8" w:color="A6A6A6"/>
-          <w:right w:val="dashed" w:sz="6" w:space="8" w:color="A6A6A6"/>
-        </w:pBdr>
         <w:jc w:val="center"/>
-        <w:spacing w:before="120" w:after="240"/>
+        <w:spacing w:before="120" w:after="80"/>
+      </w:pPr>
+      <w:r>
+        <w:drawing>
+          <wp:inline distT="0" distB="0" distL="0" distR="0">
+            <wp:extent cx="5943600" cy="3345407"/>
+            <wp:effectExtent l="0" t="0" r="0" b="0"/>
+            <wp:docPr id="2" name="Captura1"/>
+            <wp:cNvGraphicFramePr>
+              <a:graphicFrameLocks noChangeAspect="1"/>
+            </wp:cNvGraphicFramePr>
+            <a:graphic>
+              <a:graphicData uri="http://schemas.openxmlformats.org/drawingml/2006/picture">
+                <pic:pic>
+                  <pic:nvPicPr>
+                    <pic:cNvPr id="0" name="Captura1.png"/>
+                    <pic:cNvPicPr/>
+                  </pic:nvPicPr>
+                  <pic:blipFill>
+                    <a:blip r:embed="rId6"/>
+                    <a:stretch>
+                      <a:fillRect/>
+                    </a:stretch>
+                  </pic:blipFill>
+                  <pic:spPr>
+                    <a:xfrm>
+                      <a:off x="0" y="0"/>
+                      <a:ext cx="5943600" cy="3345407"/>
+                    </a:xfrm>
+                    <a:prstGeom prst="rect">
+                      <a:avLst/>
+                    </a:prstGeom>
+                  </pic:spPr>
+                </pic:pic>
+              </a:graphicData>
+            </a:graphic>
+          </wp:inline>
+        </w:drawing>
+      </w:r>
+    </w:p>
+    <w:p>
+      <w:pPr>
+        <w:jc w:val="center"/>
+        <w:spacing w:after="240"/>
       </w:pPr>
       <w:r>
         <w:rPr>
           <w:rFonts w:ascii="Calibri" w:hAnsi="Calibri"/>
           <w:i/>
-          <w:sz w:val="22"/>
-          <w:color w:val="808080"/>
-        </w:rPr>
-        <w:t>[ CAPTURA 1: pantalla de Draw.io con el diagrama terminado ]</w:t>
+          <w:sz w:val="20"/>
+          <w:color w:val="595959"/>
+        </w:rPr>
+        <w:t>Captura 1. Diagrama terminado en app.diagrams.net.</w:t>
       </w:r>
     </w:p>
     <w:p>
@@ -332,23 +345,60 @@
     </w:p>
     <w:p>
       <w:pPr>
-        <w:pBdr>
-          <w:top w:val="dashed" w:sz="6" w:space="8" w:color="A6A6A6"/>
-          <w:left w:val="dashed" w:sz="6" w:space="8" w:color="A6A6A6"/>
-          <w:bottom w:val="dashed" w:sz="6" w:space="8" w:color="A6A6A6"/>
-          <w:right w:val="dashed" w:sz="6" w:space="8" w:color="A6A6A6"/>
-        </w:pBdr>
         <w:jc w:val="center"/>
-        <w:spacing w:before="120" w:after="240"/>
+        <w:spacing w:before="120" w:after="80"/>
+      </w:pPr>
+      <w:r>
+        <w:drawing>
+          <wp:inline distT="0" distB="0" distL="0" distR="0">
+            <wp:extent cx="4114800" cy="2744580"/>
+            <wp:effectExtent l="0" t="0" r="0" b="0"/>
+            <wp:docPr id="3" name="Captura2"/>
+            <wp:cNvGraphicFramePr>
+              <a:graphicFrameLocks noChangeAspect="1"/>
+            </wp:cNvGraphicFramePr>
+            <a:graphic>
+              <a:graphicData uri="http://schemas.openxmlformats.org/drawingml/2006/picture">
+                <pic:pic>
+                  <pic:nvPicPr>
+                    <pic:cNvPr id="0" name="Captura2.png"/>
+                    <pic:cNvPicPr/>
+                  </pic:nvPicPr>
+                  <pic:blipFill>
+                    <a:blip r:embed="rId7"/>
+                    <a:stretch>
+                      <a:fillRect/>
+                    </a:stretch>
+                  </pic:blipFill>
+                  <pic:spPr>
+                    <a:xfrm>
+                      <a:off x="0" y="0"/>
+                      <a:ext cx="4114800" cy="2744580"/>
+                    </a:xfrm>
+                    <a:prstGeom prst="rect">
+                      <a:avLst/>
+                    </a:prstGeom>
+                  </pic:spPr>
+                </pic:pic>
+              </a:graphicData>
+            </a:graphic>
+          </wp:inline>
+        </w:drawing>
+      </w:r>
+    </w:p>
+    <w:p>
+      <w:pPr>
+        <w:jc w:val="center"/>
+        <w:spacing w:after="240"/>
       </w:pPr>
       <w:r>
         <w:rPr>
           <w:rFonts w:ascii="Calibri" w:hAnsi="Calibri"/>
           <w:i/>
-          <w:sz w:val="22"/>
-          <w:color w:val="808080"/>
-        </w:rPr>
-        <w:t>[ CAPTURA 2: cuadro de exportación PNG mostrando el nombre Arquitectura_S3.png ]</w:t>
+          <w:sz w:val="20"/>
+          <w:color w:val="595959"/>
+        </w:rPr>
+        <w:t>Captura 2. Cuadro de exportación a PNG en Draw.io.</w:t>
       </w:r>
     </w:p>
     <w:p>
@@ -487,23 +537,60 @@
     </w:p>
     <w:p>
       <w:pPr>
-        <w:pBdr>
-          <w:top w:val="dashed" w:sz="6" w:space="8" w:color="A6A6A6"/>
-          <w:left w:val="dashed" w:sz="6" w:space="8" w:color="A6A6A6"/>
-          <w:bottom w:val="dashed" w:sz="6" w:space="8" w:color="A6A6A6"/>
-          <w:right w:val="dashed" w:sz="6" w:space="8" w:color="A6A6A6"/>
-        </w:pBdr>
         <w:jc w:val="center"/>
-        <w:spacing w:before="120" w:after="240"/>
+        <w:spacing w:before="120" w:after="80"/>
+      </w:pPr>
+      <w:r>
+        <w:drawing>
+          <wp:inline distT="0" distB="0" distL="0" distR="0">
+            <wp:extent cx="5486400" cy="2976069"/>
+            <wp:effectExtent l="0" t="0" r="0" b="0"/>
+            <wp:docPr id="4" name="Captura3"/>
+            <wp:cNvGraphicFramePr>
+              <a:graphicFrameLocks noChangeAspect="1"/>
+            </wp:cNvGraphicFramePr>
+            <a:graphic>
+              <a:graphicData uri="http://schemas.openxmlformats.org/drawingml/2006/picture">
+                <pic:pic>
+                  <pic:nvPicPr>
+                    <pic:cNvPr id="0" name="Captura3.png"/>
+                    <pic:cNvPicPr/>
+                  </pic:nvPicPr>
+                  <pic:blipFill>
+                    <a:blip r:embed="rId8"/>
+                    <a:stretch>
+                      <a:fillRect/>
+                    </a:stretch>
+                  </pic:blipFill>
+                  <pic:spPr>
+                    <a:xfrm>
+                      <a:off x="0" y="0"/>
+                      <a:ext cx="5486400" cy="2976069"/>
+                    </a:xfrm>
+                    <a:prstGeom prst="rect">
+                      <a:avLst/>
+                    </a:prstGeom>
+                  </pic:spPr>
+                </pic:pic>
+              </a:graphicData>
+            </a:graphic>
+          </wp:inline>
+        </w:drawing>
+      </w:r>
+    </w:p>
+    <w:p>
+      <w:pPr>
+        <w:jc w:val="center"/>
+        <w:spacing w:after="240"/>
       </w:pPr>
       <w:r>
         <w:rPr>
           <w:rFonts w:ascii="Calibri" w:hAnsi="Calibri"/>
           <w:i/>
-          <w:sz w:val="22"/>
-          <w:color w:val="808080"/>
-        </w:rPr>
-        <w:t>[ CAPTURA 3: página del repositorio en GitHub mostrando la carpeta docs con Arquitectura_S3.png ]</w:t>
+          <w:sz w:val="20"/>
+          <w:color w:val="595959"/>
+        </w:rPr>
+        <w:t>Captura 3. Carpeta docs del proyecto con el diagrama y el entregable.</w:t>
       </w:r>
     </w:p>
     <w:p>

</xml_diff>